<commit_message>
i added a download button for BAC CODE OF CONDUCT and fixed my resources page group item  part
</commit_message>
<xml_diff>
--- a/WMD WEBSITE REPORT.docx
+++ b/WMD WEBSITE REPORT.docx
@@ -610,6 +610,9 @@
         <w:br w:type="page"/>
       </w:r>
       <w:r>
+        <w:rPr>
+          <w:noProof/>
+        </w:rPr>
         <w:lastRenderedPageBreak/>
         <w:drawing>
           <wp:anchor distT="0" distB="0" distL="114300" distR="114300" simplePos="0" relativeHeight="251658240" behindDoc="0" locked="0" layoutInCell="1" allowOverlap="1" wp14:anchorId="616C09B3" wp14:editId="6AA12578">
@@ -665,6 +668,9 @@
         <w:br w:type="textWrapping" w:clear="all"/>
       </w:r>
       <w:r>
+        <w:rPr>
+          <w:noProof/>
+        </w:rPr>
         <w:lastRenderedPageBreak/>
         <w:drawing>
           <wp:inline distT="0" distB="0" distL="0" distR="0" wp14:anchorId="0E63D9EE" wp14:editId="27AC3E67">
@@ -708,6 +714,9 @@
         <w:jc w:val="center"/>
       </w:pPr>
       <w:r>
+        <w:rPr>
+          <w:noProof/>
+        </w:rPr>
         <w:lastRenderedPageBreak/>
         <w:drawing>
           <wp:inline distT="0" distB="0" distL="0" distR="0" wp14:anchorId="6616567D" wp14:editId="0200EE14">
@@ -751,6 +760,9 @@
         <w:jc w:val="center"/>
       </w:pPr>
       <w:r>
+        <w:rPr>
+          <w:noProof/>
+        </w:rPr>
         <w:lastRenderedPageBreak/>
         <w:drawing>
           <wp:inline distT="0" distB="0" distL="0" distR="0" wp14:anchorId="7B1A87C0" wp14:editId="43D6C6FD">
@@ -794,6 +806,9 @@
         <w:jc w:val="center"/>
       </w:pPr>
       <w:r>
+        <w:rPr>
+          <w:noProof/>
+        </w:rPr>
         <w:lastRenderedPageBreak/>
         <w:drawing>
           <wp:inline distT="0" distB="0" distL="0" distR="0" wp14:anchorId="1F166F2D" wp14:editId="3AB3D6BB">
@@ -837,6 +852,9 @@
         <w:jc w:val="center"/>
       </w:pPr>
       <w:r>
+        <w:rPr>
+          <w:noProof/>
+        </w:rPr>
         <w:lastRenderedPageBreak/>
         <w:drawing>
           <wp:inline distT="0" distB="0" distL="0" distR="0" wp14:anchorId="5F712696" wp14:editId="12E23D75">

</xml_diff>